<commit_message>
Update public offer document.
Co-authored-by: Cursor <cursoragent@cursor.com>
</commit_message>
<xml_diff>
--- a/public/legal/offer.docx
+++ b/public/legal/offer.docx
@@ -18,6 +18,12 @@
       </w:r>
     </w:p>
     <w:p>
+      <w:pPr>
+        <w:rPr>
+          <w:b/>
+          <w:bCs/>
+        </w:rPr>
+      </w:pPr>
       <w:r>
         <w:rPr>
           <w:b/>
@@ -48,7 +54,7 @@
           <w:b/>
           <w:bCs/>
         </w:rPr>
-        <w:t>Редакция от «___» __________ 2026 года</w:t>
+        <w:t>Редакция от 1 июня 2026 года</w:t>
       </w:r>
     </w:p>
     <w:p>
@@ -227,13 +233,7 @@
         <w:t>С момента акцепта настоящий договор считается заключенным, а Участник подтверждает, что ознакомился с условиями настоящей Оферты, понимает их содержание и принимает их полностью без каких-либо оговорок.</w:t>
       </w:r>
     </w:p>
-    <w:p>
-      <w:r>
-        <w:pict w14:anchorId="290CA0F5">
-          <v:rect id="_x0000_i1247" style="width:0;height:1.5pt" o:hralign="center" o:hrstd="t" o:hr="t" fillcolor="#a0a0a0" stroked="f"/>
-        </w:pict>
-      </w:r>
-    </w:p>
+    <w:p/>
     <w:p>
       <w:pPr>
         <w:rPr>
@@ -274,13 +274,7 @@
         <w:t>Индивидуальный предприниматель Нагорский Виктор Сергеевич, оказывающий услуги, предусмотренные настоящей Офертой.</w:t>
       </w:r>
     </w:p>
-    <w:p>
-      <w:r>
-        <w:pict w14:anchorId="6487B20A">
-          <v:rect id="_x0000_i1248" style="width:0;height:1.5pt" o:hralign="center" o:hrstd="t" o:hr="t" fillcolor="#a0a0a0" stroked="f"/>
-        </w:pict>
-      </w:r>
-    </w:p>
+    <w:p/>
     <w:p>
       <w:pPr>
         <w:rPr>
@@ -301,13 +295,7 @@
         <w:t>Физическое лицо, принявшее условия настоящей Оферты путем ее акцепта.</w:t>
       </w:r>
     </w:p>
-    <w:p>
-      <w:r>
-        <w:pict w14:anchorId="44C61E12">
-          <v:rect id="_x0000_i1249" style="width:0;height:1.5pt" o:hralign="center" o:hrstd="t" o:hr="t" fillcolor="#a0a0a0" stroked="f"/>
-        </w:pict>
-      </w:r>
-    </w:p>
+    <w:p/>
     <w:p>
       <w:pPr>
         <w:rPr>
@@ -355,13 +343,7 @@
         <w:t>Программа не является образовательной программой в смысле Федерального закона №273-ФЗ «Об образовании в Российской Федерации» и не сопровождается выдачей документов государственного образца.</w:t>
       </w:r>
     </w:p>
-    <w:p>
-      <w:r>
-        <w:pict w14:anchorId="7F7C7CB7">
-          <v:rect id="_x0000_i1250" style="width:0;height:1.5pt" o:hralign="center" o:hrstd="t" o:hr="t" fillcolor="#a0a0a0" stroked="f"/>
-        </w:pict>
-      </w:r>
-    </w:p>
+    <w:p/>
     <w:p>
       <w:pPr>
         <w:rPr>
@@ -382,13 +364,7 @@
         <w:t>Онлайн-встреча, проводимая Исполнителем либо привлеченным специалистом посредством сети Интернет, направленная на формирование практических навыков Участника.</w:t>
       </w:r>
     </w:p>
-    <w:p>
-      <w:r>
-        <w:pict w14:anchorId="65C97310">
-          <v:rect id="_x0000_i1251" style="width:0;height:1.5pt" o:hralign="center" o:hrstd="t" o:hr="t" fillcolor="#a0a0a0" stroked="f"/>
-        </w:pict>
-      </w:r>
-    </w:p>
+    <w:p/>
     <w:p>
       <w:pPr>
         <w:rPr>
@@ -409,13 +385,7 @@
         <w:t>Специалист, привлеченный Исполнителем для проведения практических занятий, проверки заданий, консультирования и сопровождения участников.</w:t>
       </w:r>
     </w:p>
-    <w:p>
-      <w:r>
-        <w:pict w14:anchorId="7C500CF1">
-          <v:rect id="_x0000_i1252" style="width:0;height:1.5pt" o:hralign="center" o:hrstd="t" o:hr="t" fillcolor="#a0a0a0" stroked="f"/>
-        </w:pict>
-      </w:r>
-    </w:p>
+    <w:p/>
     <w:p>
       <w:pPr>
         <w:rPr>
@@ -518,13 +488,7 @@
         <w:t xml:space="preserve">иные действия по усмотрению Исполнителя. </w:t>
       </w:r>
     </w:p>
-    <w:p>
-      <w:r>
-        <w:pict w14:anchorId="260D7B7A">
-          <v:rect id="_x0000_i1253" style="width:0;height:1.5pt" o:hralign="center" o:hrstd="t" o:hr="t" fillcolor="#a0a0a0" stroked="f"/>
-        </w:pict>
-      </w:r>
-    </w:p>
+    <w:p/>
     <w:p>
       <w:pPr>
         <w:rPr>
@@ -545,13 +509,7 @@
         <w:t>Любые текстовые, графические, аудио-, видео-, презентационные, методические и иные материалы, предоставляемые Исполнителем.</w:t>
       </w:r>
     </w:p>
-    <w:p>
-      <w:r>
-        <w:pict w14:anchorId="6E46CFF5">
-          <v:rect id="_x0000_i1254" style="width:0;height:1.5pt" o:hralign="center" o:hrstd="t" o:hr="t" fillcolor="#a0a0a0" stroked="f"/>
-        </w:pict>
-      </w:r>
-    </w:p>
+    <w:p/>
     <w:p>
       <w:pPr>
         <w:rPr>
@@ -649,13 +607,7 @@
         <w:t>Исполнитель вправе изменять используемые сервисы без получения дополнительного согласия Участника.</w:t>
       </w:r>
     </w:p>
-    <w:p>
-      <w:r>
-        <w:pict w14:anchorId="2DA4E5A3">
-          <v:rect id="_x0000_i1255" style="width:0;height:1.5pt" o:hralign="center" o:hrstd="t" o:hr="t" fillcolor="#a0a0a0" stroked="f"/>
-        </w:pict>
-      </w:r>
-    </w:p>
+    <w:p/>
     <w:p>
       <w:pPr>
         <w:rPr>
@@ -691,13 +643,7 @@
         <w:t>Исполнитель обязуется предоставить Участнику доступ к Программе и оказать предусмотренные настоящей Офертой услуги, а Участник обязуется принять оказанные услуги и оплатить их стоимость.</w:t>
       </w:r>
     </w:p>
-    <w:p>
-      <w:r>
-        <w:pict w14:anchorId="2A0A6CF7">
-          <v:rect id="_x0000_i1256" style="width:0;height:1.5pt" o:hralign="center" o:hrstd="t" o:hr="t" fillcolor="#a0a0a0" stroked="f"/>
-        </w:pict>
-      </w:r>
-    </w:p>
+    <w:p/>
     <w:p>
       <w:pPr>
         <w:rPr>
@@ -877,13 +823,7 @@
         <w:t>Конкретный состав определяется Исполнителем самостоятельно.</w:t>
       </w:r>
     </w:p>
-    <w:p>
-      <w:r>
-        <w:pict w14:anchorId="6D0315E5">
-          <v:rect id="_x0000_i1257" style="width:0;height:1.5pt" o:hralign="center" o:hrstd="t" o:hr="t" fillcolor="#a0a0a0" stroked="f"/>
-        </w:pict>
-      </w:r>
-    </w:p>
+    <w:p/>
     <w:p>
       <w:pPr>
         <w:rPr>
@@ -943,13 +883,7 @@
         <w:t>Исполнитель вправе изменять внутреннюю структуру Программы без уменьшения общего объема оказываемых услуг.</w:t>
       </w:r>
     </w:p>
-    <w:p>
-      <w:r>
-        <w:pict w14:anchorId="2A6BEE0D">
-          <v:rect id="_x0000_i1258" style="width:0;height:1.5pt" o:hralign="center" o:hrstd="t" o:hr="t" fillcolor="#a0a0a0" stroked="f"/>
-        </w:pict>
-      </w:r>
-    </w:p>
+    <w:p/>
     <w:p>
       <w:pPr>
         <w:rPr>
@@ -1058,13 +992,7 @@
         <w:t xml:space="preserve">перечень работодателей. </w:t>
       </w:r>
     </w:p>
-    <w:p>
-      <w:r>
-        <w:pict w14:anchorId="099825F1">
-          <v:rect id="_x0000_i1259" style="width:0;height:1.5pt" o:hralign="center" o:hrstd="t" o:hr="t" fillcolor="#a0a0a0" stroked="f"/>
-        </w:pict>
-      </w:r>
-    </w:p>
+    <w:p/>
     <w:p>
       <w:pPr>
         <w:rPr>
@@ -1085,13 +1013,7 @@
         <w:t>Участник понимает, что предметом настоящего договора является оказание услуг, а не достижение конкретного результата в виде получения определенной должности, заработной платы либо трудоустройства в конкретную организацию.</w:t>
       </w:r>
     </w:p>
-    <w:p>
-      <w:r>
-        <w:pict w14:anchorId="2CF45163">
-          <v:rect id="_x0000_i1260" style="width:0;height:1.5pt" o:hralign="center" o:hrstd="t" o:hr="t" fillcolor="#a0a0a0" stroked="f"/>
-        </w:pict>
-      </w:r>
-    </w:p>
+    <w:p/>
     <w:p>
       <w:pPr>
         <w:rPr>
@@ -1171,13 +1093,7 @@
         <w:t xml:space="preserve">либо сообщается Участнику до момента оплаты. </w:t>
       </w:r>
     </w:p>
-    <w:p>
-      <w:r>
-        <w:pict w14:anchorId="33E31DB4">
-          <v:rect id="_x0000_i1261" style="width:0;height:1.5pt" o:hralign="center" o:hrstd="t" o:hr="t" fillcolor="#a0a0a0" stroked="f"/>
-        </w:pict>
-      </w:r>
-    </w:p>
+    <w:p/>
     <w:p>
       <w:pPr>
         <w:rPr>
@@ -1243,13 +1159,7 @@
         <w:t xml:space="preserve">иными способами, предусмотренными Исполнителем. </w:t>
       </w:r>
     </w:p>
-    <w:p>
-      <w:r>
-        <w:pict w14:anchorId="2AF75AF5">
-          <v:rect id="_x0000_i1262" style="width:0;height:1.5pt" o:hralign="center" o:hrstd="t" o:hr="t" fillcolor="#a0a0a0" stroked="f"/>
-        </w:pict>
-      </w:r>
-    </w:p>
+    <w:p/>
     <w:p>
       <w:pPr>
         <w:rPr>
@@ -1270,13 +1180,7 @@
         <w:t>Обязанность по оплате считается исполненной с момента поступления денежных средств на расчетный счет Исполнителя либо подтверждения платежной системой успешного платежа.</w:t>
       </w:r>
     </w:p>
-    <w:p>
-      <w:r>
-        <w:pict w14:anchorId="6E69374D">
-          <v:rect id="_x0000_i1263" style="width:0;height:1.5pt" o:hralign="center" o:hrstd="t" o:hr="t" fillcolor="#a0a0a0" stroked="f"/>
-        </w:pict>
-      </w:r>
-    </w:p>
+    <w:p/>
     <w:p>
       <w:pPr>
         <w:rPr>
@@ -1297,13 +1201,7 @@
         <w:t>Расходы банков, платежных систем и кредитных организаций оплачиваются Участником самостоятельно, если иное прямо не предусмотрено Исполнителем.</w:t>
       </w:r>
     </w:p>
-    <w:p>
-      <w:r>
-        <w:pict w14:anchorId="557B7E0E">
-          <v:rect id="_x0000_i1264" style="width:0;height:1.5pt" o:hralign="center" o:hrstd="t" o:hr="t" fillcolor="#a0a0a0" stroked="f"/>
-        </w:pict>
-      </w:r>
-    </w:p>
+    <w:p/>
     <w:p>
       <w:pPr>
         <w:rPr>
@@ -1329,13 +1227,7 @@
         <w:t>Исполнитель не является стороной кредитного договора и не отвечает за условия предоставления кредита либо рассрочки.</w:t>
       </w:r>
     </w:p>
-    <w:p>
-      <w:r>
-        <w:pict w14:anchorId="7D9FCD4D">
-          <v:rect id="_x0000_i1265" style="width:0;height:1.5pt" o:hralign="center" o:hrstd="t" o:hr="t" fillcolor="#a0a0a0" stroked="f"/>
-        </w:pict>
-      </w:r>
-    </w:p>
+    <w:p/>
     <w:p>
       <w:pPr>
         <w:rPr>
@@ -1400,13 +1292,7 @@
         <w:t xml:space="preserve">отказаться от исполнения договора. </w:t>
       </w:r>
     </w:p>
-    <w:p>
-      <w:r>
-        <w:pict w14:anchorId="76940A97">
-          <v:rect id="_x0000_i1266" style="width:0;height:1.5pt" o:hralign="center" o:hrstd="t" o:hr="t" fillcolor="#a0a0a0" stroked="f"/>
-        </w:pict>
-      </w:r>
-    </w:p>
+    <w:p/>
     <w:p>
       <w:pPr>
         <w:rPr>
@@ -1486,13 +1372,7 @@
         <w:t xml:space="preserve">получает доступ к Платформе. </w:t>
       </w:r>
     </w:p>
-    <w:p>
-      <w:r>
-        <w:pict w14:anchorId="28673A5E">
-          <v:rect id="_x0000_i1267" style="width:0;height:1.5pt" o:hralign="center" o:hrstd="t" o:hr="t" fillcolor="#a0a0a0" stroked="f"/>
-        </w:pict>
-      </w:r>
-    </w:p>
+    <w:p/>
     <w:p>
       <w:pPr>
         <w:rPr>
@@ -1513,14 +1393,7 @@
         <w:t>После подтверждения оплаты Исполнитель предоставляет инструкции по подключению.</w:t>
       </w:r>
     </w:p>
-    <w:p>
-      <w:r>
-        <w:lastRenderedPageBreak/>
-        <w:pict w14:anchorId="1B36F733">
-          <v:rect id="_x0000_i1268" style="width:0;height:1.5pt" o:hralign="center" o:hrstd="t" o:hr="t" fillcolor="#a0a0a0" stroked="f"/>
-        </w:pict>
-      </w:r>
-    </w:p>
+    <w:p/>
     <w:p>
       <w:pPr>
         <w:rPr>
@@ -1554,13 +1427,7 @@
         <w:t>Исполнитель вправе использовать любые дополнительные средства связи.</w:t>
       </w:r>
     </w:p>
-    <w:p>
-      <w:r>
-        <w:pict w14:anchorId="26B62B35">
-          <v:rect id="_x0000_i1269" style="width:0;height:1.5pt" o:hralign="center" o:hrstd="t" o:hr="t" fillcolor="#a0a0a0" stroked="f"/>
-        </w:pict>
-      </w:r>
-    </w:p>
+    <w:p/>
     <w:p>
       <w:pPr>
         <w:rPr>
@@ -1581,13 +1448,7 @@
         <w:t>Практические занятия проводятся посредством Яндекс Телемоста либо иных платформ видеоконференцсвязи.</w:t>
       </w:r>
     </w:p>
-    <w:p>
-      <w:r>
-        <w:pict w14:anchorId="35A45544">
-          <v:rect id="_x0000_i1270" style="width:0;height:1.5pt" o:hralign="center" o:hrstd="t" o:hr="t" fillcolor="#a0a0a0" stroked="f"/>
-        </w:pict>
-      </w:r>
-    </w:p>
+    <w:p/>
     <w:p>
       <w:pPr>
         <w:rPr>
@@ -1613,13 +1474,7 @@
         <w:t>Такие изменения не считаются нарушением договора при условии сохранения общего объема услуг.</w:t>
       </w:r>
     </w:p>
-    <w:p>
-      <w:r>
-        <w:pict w14:anchorId="7C67D057">
-          <v:rect id="_x0000_i1271" style="width:0;height:1.5pt" o:hralign="center" o:hrstd="t" o:hr="t" fillcolor="#a0a0a0" stroked="f"/>
-        </w:pict>
-      </w:r>
-    </w:p>
+    <w:p/>
     <w:p>
       <w:pPr>
         <w:rPr>
@@ -1700,13 +1555,7 @@
         <w:t>Исполнитель не отвечает за невозможность участия, вызванную техническими проблемами на стороне Участника.</w:t>
       </w:r>
     </w:p>
-    <w:p>
-      <w:r>
-        <w:pict w14:anchorId="35B0941D">
-          <v:rect id="_x0000_i1272" style="width:0;height:1.5pt" o:hralign="center" o:hrstd="t" o:hr="t" fillcolor="#a0a0a0" stroked="f"/>
-        </w:pict>
-      </w:r>
-    </w:p>
+    <w:p/>
     <w:p>
       <w:pPr>
         <w:rPr>
@@ -1732,13 +1581,7 @@
         <w:t>Исполнитель не обязан повторно проводить пропущенную часть занятия.</w:t>
       </w:r>
     </w:p>
-    <w:p>
-      <w:r>
-        <w:pict w14:anchorId="522EF5C6">
-          <v:rect id="_x0000_i1273" style="width:0;height:1.5pt" o:hralign="center" o:hrstd="t" o:hr="t" fillcolor="#a0a0a0" stroked="f"/>
-        </w:pict>
-      </w:r>
-    </w:p>
+    <w:p/>
     <w:p>
       <w:pPr>
         <w:rPr>
@@ -1804,13 +1647,7 @@
         <w:t xml:space="preserve">возврата денежных средств. </w:t>
       </w:r>
     </w:p>
-    <w:p>
-      <w:r>
-        <w:pict w14:anchorId="6E979394">
-          <v:rect id="_x0000_i1274" style="width:0;height:1.5pt" o:hralign="center" o:hrstd="t" o:hr="t" fillcolor="#a0a0a0" stroked="f"/>
-        </w:pict>
-      </w:r>
-    </w:p>
+    <w:p/>
     <w:p>
       <w:pPr>
         <w:rPr>
@@ -1846,13 +1683,7 @@
         <w:t>Материалы предоставляются исключительно для личного использования Участником.</w:t>
       </w:r>
     </w:p>
-    <w:p>
-      <w:r>
-        <w:pict w14:anchorId="48058F20">
-          <v:rect id="_x0000_i1275" style="width:0;height:1.5pt" o:hralign="center" o:hrstd="t" o:hr="t" fillcolor="#a0a0a0" stroked="f"/>
-        </w:pict>
-      </w:r>
-    </w:p>
+    <w:p/>
     <w:p>
       <w:pPr>
         <w:rPr>
@@ -1883,13 +1714,7 @@
         <w:t>, если Исполнителем не установлен иной срок.</w:t>
       </w:r>
     </w:p>
-    <w:p>
-      <w:r>
-        <w:pict w14:anchorId="185089EE">
-          <v:rect id="_x0000_i1276" style="width:0;height:1.5pt" o:hralign="center" o:hrstd="t" o:hr="t" fillcolor="#a0a0a0" stroked="f"/>
-        </w:pict>
-      </w:r>
-    </w:p>
+    <w:p/>
     <w:p>
       <w:pPr>
         <w:rPr>
@@ -1910,13 +1735,7 @@
         <w:t>Методические материалы предоставляются на бессрочной основе, если иное не установлено Исполнителем.</w:t>
       </w:r>
     </w:p>
-    <w:p>
-      <w:r>
-        <w:pict w14:anchorId="64C837FD">
-          <v:rect id="_x0000_i1277" style="width:0;height:1.5pt" o:hralign="center" o:hrstd="t" o:hr="t" fillcolor="#a0a0a0" stroked="f"/>
-        </w:pict>
-      </w:r>
-    </w:p>
+    <w:p/>
     <w:p>
       <w:pPr>
         <w:rPr>
@@ -1937,13 +1756,7 @@
         <w:t>Исполнитель вправе обновлять, дополнять, изменять либо удалять материалы без предварительного уведомления Участника.</w:t>
       </w:r>
     </w:p>
-    <w:p>
-      <w:r>
-        <w:pict w14:anchorId="7018DE84">
-          <v:rect id="_x0000_i1278" style="width:0;height:1.5pt" o:hralign="center" o:hrstd="t" o:hr="t" fillcolor="#a0a0a0" stroked="f"/>
-        </w:pict>
-      </w:r>
-    </w:p>
+    <w:p/>
     <w:p>
       <w:pPr>
         <w:rPr>
@@ -1964,13 +1777,7 @@
         <w:t>Факт открытия материалов, скачивания файлов либо получения доступа к ним признается фактом оказания соответствующей части услуг.</w:t>
       </w:r>
     </w:p>
-    <w:p>
-      <w:r>
-        <w:pict w14:anchorId="051D6697">
-          <v:rect id="_x0000_i1279" style="width:0;height:1.5pt" o:hralign="center" o:hrstd="t" o:hr="t" fillcolor="#a0a0a0" stroked="f"/>
-        </w:pict>
-      </w:r>
-    </w:p>
+    <w:p/>
     <w:p>
       <w:pPr>
         <w:rPr>
@@ -2006,13 +1813,7 @@
         <w:t>По завершении практической части Программы Участник проходит итоговую аттестацию.</w:t>
       </w:r>
     </w:p>
-    <w:p>
-      <w:r>
-        <w:pict w14:anchorId="53F5736A">
-          <v:rect id="_x0000_i1280" style="width:0;height:1.5pt" o:hralign="center" o:hrstd="t" o:hr="t" fillcolor="#a0a0a0" stroked="f"/>
-        </w:pict>
-      </w:r>
-    </w:p>
+    <w:p/>
     <w:p>
       <w:pPr>
         <w:rPr>
@@ -2033,13 +1834,7 @@
         <w:t>Форма, критерии и порядок проведения аттестации определяются Исполнителем самостоятельно.</w:t>
       </w:r>
     </w:p>
-    <w:p>
-      <w:r>
-        <w:pict w14:anchorId="0A598B11">
-          <v:rect id="_x0000_i1281" style="width:0;height:1.5pt" o:hralign="center" o:hrstd="t" o:hr="t" fillcolor="#a0a0a0" stroked="f"/>
-        </w:pict>
-      </w:r>
-    </w:p>
+    <w:p/>
     <w:p>
       <w:pPr>
         <w:rPr>
@@ -2065,13 +1860,7 @@
         <w:t>Количество попыток повторной аттестации не ограничивается, если Исполнитель не установит иной порядок.</w:t>
       </w:r>
     </w:p>
-    <w:p>
-      <w:r>
-        <w:pict w14:anchorId="2838D1AF">
-          <v:rect id="_x0000_i1282" style="width:0;height:1.5pt" o:hralign="center" o:hrstd="t" o:hr="t" fillcolor="#a0a0a0" stroked="f"/>
-        </w:pict>
-      </w:r>
-    </w:p>
+    <w:p/>
     <w:p>
       <w:pPr>
         <w:rPr>
@@ -2093,13 +1882,7 @@
         <w:t>После успешного прохождения аттестации Исполнитель вправе подготовить рекомендательное письмо.</w:t>
       </w:r>
     </w:p>
-    <w:p>
-      <w:r>
-        <w:pict w14:anchorId="26D0FD7E">
-          <v:rect id="_x0000_i1283" style="width:0;height:1.5pt" o:hralign="center" o:hrstd="t" o:hr="t" fillcolor="#a0a0a0" stroked="f"/>
-        </w:pict>
-      </w:r>
-    </w:p>
+    <w:p/>
     <w:p>
       <w:pPr>
         <w:rPr>
@@ -2170,13 +1953,7 @@
         <w:t>, если иной срок не установлен Исполнителем.</w:t>
       </w:r>
     </w:p>
-    <w:p>
-      <w:r>
-        <w:pict w14:anchorId="1C8D9FC0">
-          <v:rect id="_x0000_i2107" style="width:0;height:1.5pt" o:hralign="center" o:hrstd="t" o:hr="t" fillcolor="#a0a0a0" stroked="f"/>
-        </w:pict>
-      </w:r>
-    </w:p>
+    <w:p/>
     <w:p>
       <w:pPr>
         <w:rPr>
@@ -2312,13 +2089,7 @@
         <w:t>Исполнитель самостоятельно определяет объем услуг, необходимых конкретному Участнику.</w:t>
       </w:r>
     </w:p>
-    <w:p>
-      <w:r>
-        <w:pict w14:anchorId="00364FF0">
-          <v:rect id="_x0000_i2108" style="width:0;height:1.5pt" o:hralign="center" o:hrstd="t" o:hr="t" fillcolor="#a0a0a0" stroked="f"/>
-        </w:pict>
-      </w:r>
-    </w:p>
+    <w:p/>
     <w:p>
       <w:pPr>
         <w:rPr>
@@ -2406,13 +2177,7 @@
         <w:t xml:space="preserve">готовность Участника к прохождению собеседований. </w:t>
       </w:r>
     </w:p>
-    <w:p>
-      <w:r>
-        <w:pict w14:anchorId="3EA54CBB">
-          <v:rect id="_x0000_i2109" style="width:0;height:1.5pt" o:hralign="center" o:hrstd="t" o:hr="t" fillcolor="#a0a0a0" stroked="f"/>
-        </w:pict>
-      </w:r>
-    </w:p>
+    <w:p/>
     <w:p>
       <w:pPr>
         <w:rPr>
@@ -2433,13 +2198,7 @@
         <w:t>Исполнитель вправе отказать в направлении кандидата работодателям до устранения недостатков, препятствующих успешному прохождению собеседований.</w:t>
       </w:r>
     </w:p>
-    <w:p>
-      <w:r>
-        <w:pict w14:anchorId="667D71A8">
-          <v:rect id="_x0000_i2110" style="width:0;height:1.5pt" o:hralign="center" o:hrstd="t" o:hr="t" fillcolor="#a0a0a0" stroked="f"/>
-        </w:pict>
-      </w:r>
-    </w:p>
+    <w:p/>
     <w:p>
       <w:pPr>
         <w:rPr>
@@ -2515,13 +2274,7 @@
         <w:t xml:space="preserve">выполнение работ для индивидуального предпринимателя либо юридического лица. </w:t>
       </w:r>
     </w:p>
-    <w:p>
-      <w:r>
-        <w:pict w14:anchorId="757E2C72">
-          <v:rect id="_x0000_i2111" style="width:0;height:1.5pt" o:hralign="center" o:hrstd="t" o:hr="t" fillcolor="#a0a0a0" stroked="f"/>
-        </w:pict>
-      </w:r>
-    </w:p>
+    <w:p/>
     <w:p>
       <w:pPr>
         <w:rPr>
@@ -2542,13 +2295,7 @@
         <w:t>Исполнитель оказывает содействие трудоустройству, однако не является работодателем и не принимает решения о приеме кандидата на работу.</w:t>
       </w:r>
     </w:p>
-    <w:p>
-      <w:r>
-        <w:pict w14:anchorId="047BF945">
-          <v:rect id="_x0000_i2112" style="width:0;height:1.5pt" o:hralign="center" o:hrstd="t" o:hr="t" fillcolor="#a0a0a0" stroked="f"/>
-        </w:pict>
-      </w:r>
-    </w:p>
+    <w:p/>
     <w:p>
       <w:pPr>
         <w:rPr>
@@ -2574,13 +2321,7 @@
         <w:t>Исполнитель не оказывает влияния на результаты собеседований и кадровые решения работодателей.</w:t>
       </w:r>
     </w:p>
-    <w:p>
-      <w:r>
-        <w:pict w14:anchorId="23167641">
-          <v:rect id="_x0000_i2113" style="width:0;height:1.5pt" o:hralign="center" o:hrstd="t" o:hr="t" fillcolor="#a0a0a0" stroked="f"/>
-        </w:pict>
-      </w:r>
-    </w:p>
+    <w:p/>
     <w:p>
       <w:pPr>
         <w:rPr>
@@ -2667,13 +2408,7 @@
         <w:t xml:space="preserve">сохранение рабочего места. </w:t>
       </w:r>
     </w:p>
-    <w:p>
-      <w:r>
-        <w:pict w14:anchorId="2FC35935">
-          <v:rect id="_x0000_i2114" style="width:0;height:1.5pt" o:hralign="center" o:hrstd="t" o:hr="t" fillcolor="#a0a0a0" stroked="f"/>
-        </w:pict>
-      </w:r>
-    </w:p>
+    <w:p/>
     <w:p>
       <w:pPr>
         <w:rPr>
@@ -2739,13 +2474,7 @@
         <w:t xml:space="preserve">в иных случаях, предусмотренных настоящей Офертой. </w:t>
       </w:r>
     </w:p>
-    <w:p>
-      <w:r>
-        <w:pict w14:anchorId="74420591">
-          <v:rect id="_x0000_i2115" style="width:0;height:1.5pt" o:hralign="center" o:hrstd="t" o:hr="t" fillcolor="#a0a0a0" stroked="f"/>
-        </w:pict>
-      </w:r>
-    </w:p>
+    <w:p/>
     <w:p>
       <w:pPr>
         <w:rPr>
@@ -2776,13 +2505,7 @@
         <w:t xml:space="preserve"> подряд не выходит на связь без предварительного уведомления Исполнителя, карьерное сопровождение считается завершенным.</w:t>
       </w:r>
     </w:p>
-    <w:p>
-      <w:r>
-        <w:pict w14:anchorId="23DC782D">
-          <v:rect id="_x0000_i2116" style="width:0;height:1.5pt" o:hralign="center" o:hrstd="t" o:hr="t" fillcolor="#a0a0a0" stroked="f"/>
-        </w:pict>
-      </w:r>
-    </w:p>
+    <w:p/>
     <w:p>
       <w:pPr>
         <w:rPr>
@@ -2823,13 +2546,7 @@
         <w:t>Самостоятельно определять программу проведения практических занятий.</w:t>
       </w:r>
     </w:p>
-    <w:p>
-      <w:r>
-        <w:pict w14:anchorId="5BFB0A6C">
-          <v:rect id="_x0000_i2117" style="width:0;height:1.5pt" o:hralign="center" o:hrstd="t" o:hr="t" fillcolor="#a0a0a0" stroked="f"/>
-        </w:pict>
-      </w:r>
-    </w:p>
+    <w:p/>
     <w:p>
       <w:pPr>
         <w:rPr>
@@ -2850,13 +2567,7 @@
         <w:t>Изменять расписание, темы занятий, преподавателей и последовательность прохождения материала.</w:t>
       </w:r>
     </w:p>
-    <w:p>
-      <w:r>
-        <w:pict w14:anchorId="48CBB44A">
-          <v:rect id="_x0000_i2118" style="width:0;height:1.5pt" o:hralign="center" o:hrstd="t" o:hr="t" fillcolor="#a0a0a0" stroked="f"/>
-        </w:pict>
-      </w:r>
-    </w:p>
+    <w:p/>
     <w:p>
       <w:pPr>
         <w:rPr>
@@ -2877,13 +2588,7 @@
         <w:t>Использовать любые цифровые сервисы, платформы и программное обеспечение.</w:t>
       </w:r>
     </w:p>
-    <w:p>
-      <w:r>
-        <w:pict w14:anchorId="49D059AB">
-          <v:rect id="_x0000_i2119" style="width:0;height:1.5pt" o:hralign="center" o:hrstd="t" o:hr="t" fillcolor="#a0a0a0" stroked="f"/>
-        </w:pict>
-      </w:r>
-    </w:p>
+    <w:p/>
     <w:p>
       <w:pPr>
         <w:rPr>
@@ -2904,13 +2609,7 @@
         <w:t>Привлекать третьих лиц для исполнения своих обязательств без получения дополнительного согласия Участника.</w:t>
       </w:r>
     </w:p>
-    <w:p>
-      <w:r>
-        <w:pict w14:anchorId="590CC658">
-          <v:rect id="_x0000_i2120" style="width:0;height:1.5pt" o:hralign="center" o:hrstd="t" o:hr="t" fillcolor="#a0a0a0" stroked="f"/>
-        </w:pict>
-      </w:r>
-    </w:p>
+    <w:p/>
     <w:p>
       <w:pPr>
         <w:rPr>
@@ -2931,13 +2630,7 @@
         <w:t>Приостанавливать оказание услуг при нарушении условий настоящей Оферты.</w:t>
       </w:r>
     </w:p>
-    <w:p>
-      <w:r>
-        <w:pict w14:anchorId="5A21F3E9">
-          <v:rect id="_x0000_i2121" style="width:0;height:1.5pt" o:hralign="center" o:hrstd="t" o:hr="t" fillcolor="#a0a0a0" stroked="f"/>
-        </w:pict>
-      </w:r>
-    </w:p>
+    <w:p/>
     <w:p>
       <w:pPr>
         <w:rPr>
@@ -2958,13 +2651,7 @@
         <w:t>Ограничивать либо прекращать доступ к материалам при нарушении исключительных прав Исполнителя.</w:t>
       </w:r>
     </w:p>
-    <w:p>
-      <w:r>
-        <w:pict w14:anchorId="63971898">
-          <v:rect id="_x0000_i2122" style="width:0;height:1.5pt" o:hralign="center" o:hrstd="t" o:hr="t" fillcolor="#a0a0a0" stroked="f"/>
-        </w:pict>
-      </w:r>
-    </w:p>
+    <w:p/>
     <w:p>
       <w:pPr>
         <w:rPr>
@@ -3079,13 +2766,7 @@
         <w:t>При этом возврат денежных средств осуществляется исключительно в случаях, предусмотренных законодательством Российской Федерации и настоящей Офертой.</w:t>
       </w:r>
     </w:p>
-    <w:p>
-      <w:r>
-        <w:pict w14:anchorId="36976F16">
-          <v:rect id="_x0000_i2123" style="width:0;height:1.5pt" o:hralign="center" o:hrstd="t" o:hr="t" fillcolor="#a0a0a0" stroked="f"/>
-        </w:pict>
-      </w:r>
-    </w:p>
+    <w:p/>
     <w:p>
       <w:pPr>
         <w:rPr>
@@ -3106,13 +2787,7 @@
         <w:t>Использовать отзывы, фотографии, видео, текстовые сообщения, выполненные задания и иные материалы, созданные либо предоставленные Участником в рамках Программы, в рекламных, информационных и маркетинговых целях без выплаты дополнительного вознаграждения, если иное не предусмотрено законодательством РФ.</w:t>
       </w:r>
     </w:p>
-    <w:p>
-      <w:r>
-        <w:pict w14:anchorId="6A8D8019">
-          <v:rect id="_x0000_i2124" style="width:0;height:1.5pt" o:hralign="center" o:hrstd="t" o:hr="t" fillcolor="#a0a0a0" stroked="f"/>
-        </w:pict>
-      </w:r>
-    </w:p>
+    <w:p/>
     <w:p>
       <w:pPr>
         <w:rPr>
@@ -3199,13 +2874,7 @@
         <w:t xml:space="preserve">отказаться от исполнения договора в случаях, предусмотренных законодательством РФ. </w:t>
       </w:r>
     </w:p>
-    <w:p>
-      <w:r>
-        <w:pict w14:anchorId="51782881">
-          <v:rect id="_x0000_i2125" style="width:0;height:1.5pt" o:hralign="center" o:hrstd="t" o:hr="t" fillcolor="#a0a0a0" stroked="f"/>
-        </w:pict>
-      </w:r>
-    </w:p>
+    <w:p/>
     <w:p>
       <w:pPr>
         <w:rPr>
@@ -3246,13 +2915,7 @@
         <w:t>Предоставить доступ к Программе после выполнения условий участия.</w:t>
       </w:r>
     </w:p>
-    <w:p>
-      <w:r>
-        <w:pict w14:anchorId="09B6CC83">
-          <v:rect id="_x0000_i2126" style="width:0;height:1.5pt" o:hralign="center" o:hrstd="t" o:hr="t" fillcolor="#a0a0a0" stroked="f"/>
-        </w:pict>
-      </w:r>
-    </w:p>
+    <w:p/>
     <w:p>
       <w:pPr>
         <w:rPr>
@@ -3274,13 +2937,7 @@
         <w:t>Организовать проведение практических занятий.</w:t>
       </w:r>
     </w:p>
-    <w:p>
-      <w:r>
-        <w:pict w14:anchorId="44D0636E">
-          <v:rect id="_x0000_i2127" style="width:0;height:1.5pt" o:hralign="center" o:hrstd="t" o:hr="t" fillcolor="#a0a0a0" stroked="f"/>
-        </w:pict>
-      </w:r>
-    </w:p>
+    <w:p/>
     <w:p>
       <w:pPr>
         <w:rPr>
@@ -3301,13 +2958,7 @@
         <w:t>Предоставить доступ к материалам.</w:t>
       </w:r>
     </w:p>
-    <w:p>
-      <w:r>
-        <w:pict w14:anchorId="09834263">
-          <v:rect id="_x0000_i2128" style="width:0;height:1.5pt" o:hralign="center" o:hrstd="t" o:hr="t" fillcolor="#a0a0a0" stroked="f"/>
-        </w:pict>
-      </w:r>
-    </w:p>
+    <w:p/>
     <w:p>
       <w:pPr>
         <w:rPr>
@@ -3328,13 +2979,7 @@
         <w:t>Оказывать консультационную поддержку в рабочие дни.</w:t>
       </w:r>
     </w:p>
-    <w:p>
-      <w:r>
-        <w:pict w14:anchorId="0B969820">
-          <v:rect id="_x0000_i2129" style="width:0;height:1.5pt" o:hralign="center" o:hrstd="t" o:hr="t" fillcolor="#a0a0a0" stroked="f"/>
-        </w:pict>
-      </w:r>
-    </w:p>
+    <w:p/>
     <w:p>
       <w:pPr>
         <w:rPr>
@@ -3355,13 +3000,7 @@
         <w:t>Подготовить профессиональное резюме и рекомендательное письмо в случаях, предусмотренных настоящей Офертой.</w:t>
       </w:r>
     </w:p>
-    <w:p>
-      <w:r>
-        <w:pict w14:anchorId="2B56B408">
-          <v:rect id="_x0000_i2130" style="width:0;height:1.5pt" o:hralign="center" o:hrstd="t" o:hr="t" fillcolor="#a0a0a0" stroked="f"/>
-        </w:pict>
-      </w:r>
-    </w:p>
+    <w:p/>
     <w:p>
       <w:pPr>
         <w:rPr>
@@ -3382,13 +3021,7 @@
         <w:t>Оказывать услуги добросовестно и разумно.</w:t>
       </w:r>
     </w:p>
-    <w:p>
-      <w:r>
-        <w:pict w14:anchorId="3845576C">
-          <v:rect id="_x0000_i2131" style="width:0;height:1.5pt" o:hralign="center" o:hrstd="t" o:hr="t" fillcolor="#a0a0a0" stroked="f"/>
-        </w:pict>
-      </w:r>
-    </w:p>
+    <w:p/>
     <w:p>
       <w:pPr>
         <w:rPr>
@@ -3429,13 +3062,7 @@
         <w:t>Предоставлять достоверную информацию.</w:t>
       </w:r>
     </w:p>
-    <w:p>
-      <w:r>
-        <w:pict w14:anchorId="57378CC5">
-          <v:rect id="_x0000_i2132" style="width:0;height:1.5pt" o:hralign="center" o:hrstd="t" o:hr="t" fillcolor="#a0a0a0" stroked="f"/>
-        </w:pict>
-      </w:r>
-    </w:p>
+    <w:p/>
     <w:p>
       <w:pPr>
         <w:rPr>
@@ -3456,13 +3083,7 @@
         <w:t>Своевременно выполнять рекомендации Исполнителя.</w:t>
       </w:r>
     </w:p>
-    <w:p>
-      <w:r>
-        <w:pict w14:anchorId="092046CC">
-          <v:rect id="_x0000_i2133" style="width:0;height:1.5pt" o:hralign="center" o:hrstd="t" o:hr="t" fillcolor="#a0a0a0" stroked="f"/>
-        </w:pict>
-      </w:r>
-    </w:p>
+    <w:p/>
     <w:p>
       <w:pPr>
         <w:rPr>
@@ -3483,13 +3104,7 @@
         <w:t>Участвовать в практических занятиях.</w:t>
       </w:r>
     </w:p>
-    <w:p>
-      <w:r>
-        <w:pict w14:anchorId="3648C2CC">
-          <v:rect id="_x0000_i2134" style="width:0;height:1.5pt" o:hralign="center" o:hrstd="t" o:hr="t" fillcolor="#a0a0a0" stroked="f"/>
-        </w:pict>
-      </w:r>
-    </w:p>
+    <w:p/>
     <w:p>
       <w:pPr>
         <w:rPr>
@@ -3510,13 +3125,7 @@
         <w:t>Выполнять практические задания.</w:t>
       </w:r>
     </w:p>
-    <w:p>
-      <w:r>
-        <w:pict w14:anchorId="2065D8EA">
-          <v:rect id="_x0000_i2135" style="width:0;height:1.5pt" o:hralign="center" o:hrstd="t" o:hr="t" fillcolor="#a0a0a0" stroked="f"/>
-        </w:pict>
-      </w:r>
-    </w:p>
+    <w:p/>
     <w:p>
       <w:pPr>
         <w:rPr>
@@ -3537,13 +3146,7 @@
         <w:t>Предоставлять сведения, необходимые для подготовки резюме.</w:t>
       </w:r>
     </w:p>
-    <w:p>
-      <w:r>
-        <w:pict w14:anchorId="7E3F4373">
-          <v:rect id="_x0000_i2136" style="width:0;height:1.5pt" o:hralign="center" o:hrstd="t" o:hr="t" fillcolor="#a0a0a0" stroked="f"/>
-        </w:pict>
-      </w:r>
-    </w:p>
+    <w:p/>
     <w:p>
       <w:pPr>
         <w:rPr>
@@ -3565,13 +3168,7 @@
         <w:t>Проходить назначенные собеседования.</w:t>
       </w:r>
     </w:p>
-    <w:p>
-      <w:r>
-        <w:pict w14:anchorId="5C0B86B1">
-          <v:rect id="_x0000_i2137" style="width:0;height:1.5pt" o:hralign="center" o:hrstd="t" o:hr="t" fillcolor="#a0a0a0" stroked="f"/>
-        </w:pict>
-      </w:r>
-    </w:p>
+    <w:p/>
     <w:p>
       <w:pPr>
         <w:rPr>
@@ -3592,13 +3189,7 @@
         <w:t>Соблюдать нормы делового общения.</w:t>
       </w:r>
     </w:p>
-    <w:p>
-      <w:r>
-        <w:pict w14:anchorId="413B0E24">
-          <v:rect id="_x0000_i2138" style="width:0;height:1.5pt" o:hralign="center" o:hrstd="t" o:hr="t" fillcolor="#a0a0a0" stroked="f"/>
-        </w:pict>
-      </w:r>
-    </w:p>
+    <w:p/>
     <w:p>
       <w:pPr>
         <w:rPr>
@@ -3619,13 +3210,7 @@
         <w:t>Не препятствовать проведению Программы.</w:t>
       </w:r>
     </w:p>
-    <w:p>
-      <w:r>
-        <w:pict w14:anchorId="119A4CC1">
-          <v:rect id="_x0000_i2139" style="width:0;height:1.5pt" o:hralign="center" o:hrstd="t" o:hr="t" fillcolor="#a0a0a0" stroked="f"/>
-        </w:pict>
-      </w:r>
-    </w:p>
+    <w:p/>
     <w:p>
       <w:pPr>
         <w:rPr>
@@ -3646,13 +3231,7 @@
         <w:t>Не использовать материалы в коммерческих целях.</w:t>
       </w:r>
     </w:p>
-    <w:p>
-      <w:r>
-        <w:pict w14:anchorId="677F3B23">
-          <v:rect id="_x0000_i2140" style="width:0;height:1.5pt" o:hralign="center" o:hrstd="t" o:hr="t" fillcolor="#a0a0a0" stroked="f"/>
-        </w:pict>
-      </w:r>
-    </w:p>
+    <w:p/>
     <w:p>
       <w:pPr>
         <w:rPr>
@@ -3681,13 +3260,7 @@
         <w:t>-чату, видеозаписям, материалам либо иным сервисам третьим лицам.</w:t>
       </w:r>
     </w:p>
-    <w:p>
-      <w:r>
-        <w:pict w14:anchorId="170CA24E">
-          <v:rect id="_x0000_i2141" style="width:0;height:1.5pt" o:hralign="center" o:hrstd="t" o:hr="t" fillcolor="#a0a0a0" stroked="f"/>
-        </w:pict>
-      </w:r>
-    </w:p>
+    <w:p/>
     <w:p>
       <w:pPr>
         <w:rPr>
@@ -3708,13 +3281,7 @@
         <w:t>Не осуществлять запись практических занятий без письменного разрешения Исполнителя.</w:t>
       </w:r>
     </w:p>
-    <w:p>
-      <w:r>
-        <w:pict w14:anchorId="5ABB5616">
-          <v:rect id="_x0000_i2142" style="width:0;height:1.5pt" o:hralign="center" o:hrstd="t" o:hr="t" fillcolor="#a0a0a0" stroked="f"/>
-        </w:pict>
-      </w:r>
-    </w:p>
+    <w:p/>
     <w:p>
       <w:pPr>
         <w:rPr>
@@ -3735,13 +3302,7 @@
         <w:t>Не распространять сведения, составляющие коммерческую тайну Исполнителя.</w:t>
       </w:r>
     </w:p>
-    <w:p>
-      <w:r>
-        <w:pict w14:anchorId="5FE27C55">
-          <v:rect id="_x0000_i2143" style="width:0;height:1.5pt" o:hralign="center" o:hrstd="t" o:hr="t" fillcolor="#a0a0a0" stroked="f"/>
-        </w:pict>
-      </w:r>
-    </w:p>
+    <w:p/>
     <w:p>
       <w:pPr>
         <w:rPr>
@@ -3777,13 +3338,7 @@
         <w:t>Все материалы Программы являются результатами интеллектуальной деятельности и охраняются законодательством Российской Федерации.</w:t>
       </w:r>
     </w:p>
-    <w:p>
-      <w:r>
-        <w:pict w14:anchorId="0EC8A9C4">
-          <v:rect id="_x0000_i2144" style="width:0;height:1.5pt" o:hralign="center" o:hrstd="t" o:hr="t" fillcolor="#a0a0a0" stroked="f"/>
-        </w:pict>
-      </w:r>
-    </w:p>
+    <w:p/>
     <w:p>
       <w:pPr>
         <w:rPr>
@@ -3804,13 +3359,7 @@
         <w:t>Исключительные права на материалы принадлежат Исполнителю либо иным правообладателям.</w:t>
       </w:r>
     </w:p>
-    <w:p>
-      <w:r>
-        <w:pict w14:anchorId="4325725C">
-          <v:rect id="_x0000_i2145" style="width:0;height:1.5pt" o:hralign="center" o:hrstd="t" o:hr="t" fillcolor="#a0a0a0" stroked="f"/>
-        </w:pict>
-      </w:r>
-    </w:p>
+    <w:p/>
     <w:p>
       <w:pPr>
         <w:rPr>
@@ -3831,13 +3380,7 @@
         <w:t>Участнику предоставляется простая неисключительная лицензия исключительно для личного использования материалов.</w:t>
       </w:r>
     </w:p>
-    <w:p>
-      <w:r>
-        <w:pict w14:anchorId="0EA10911">
-          <v:rect id="_x0000_i2146" style="width:0;height:1.5pt" o:hralign="center" o:hrstd="t" o:hr="t" fillcolor="#a0a0a0" stroked="f"/>
-        </w:pict>
-      </w:r>
-    </w:p>
+    <w:p/>
     <w:p>
       <w:pPr>
         <w:rPr>
@@ -3947,13 +3490,7 @@
         <w:t xml:space="preserve">использовать материалы для обучения третьих лиц. </w:t>
       </w:r>
     </w:p>
-    <w:p>
-      <w:r>
-        <w:pict w14:anchorId="52E59C41">
-          <v:rect id="_x0000_i2147" style="width:0;height:1.5pt" o:hralign="center" o:hrstd="t" o:hr="t" fillcolor="#a0a0a0" stroked="f"/>
-        </w:pict>
-      </w:r>
-    </w:p>
+    <w:p/>
     <w:p>
       <w:pPr>
         <w:rPr>
@@ -3982,13 +3519,7 @@
         <w:t>-группам, видеозаписям либо материалам считается существенным нарушением настоящей Оферты.</w:t>
       </w:r>
     </w:p>
-    <w:p>
-      <w:r>
-        <w:pict w14:anchorId="4DA8439A">
-          <v:rect id="_x0000_i2148" style="width:0;height:1.5pt" o:hralign="center" o:hrstd="t" o:hr="t" fillcolor="#a0a0a0" stroked="f"/>
-        </w:pict>
-      </w:r>
-    </w:p>
+    <w:p/>
     <w:p>
       <w:pPr>
         <w:rPr>
@@ -4009,13 +3540,7 @@
         <w:t>При выявлении нарушения Исполнитель вправе незамедлительно прекратить доступ Участника к Программе без возврата стоимости уже оказанных услуг и потребовать возмещения причиненных убытков в порядке, установленном законодательством РФ.</w:t>
       </w:r>
     </w:p>
-    <w:p>
-      <w:r>
-        <w:pict w14:anchorId="4B364A8E">
-          <v:rect id="_x0000_i2149" style="width:0;height:1.5pt" o:hralign="center" o:hrstd="t" o:hr="t" fillcolor="#a0a0a0" stroked="f"/>
-        </w:pict>
-      </w:r>
-    </w:p>
+    <w:p/>
     <w:p>
       <w:pPr>
         <w:rPr>
@@ -4051,13 +3576,7 @@
         <w:t>Вся информация, полученная Участником в ходе участия в Программе, включая внутренние документы, методики, инструкции, коммерческие сведения, базы работодателей, CRM-процессы, скрипты продаж и иную информацию, не предназначенную для публичного распространения, признается конфиденциальной.</w:t>
       </w:r>
     </w:p>
-    <w:p>
-      <w:r>
-        <w:pict w14:anchorId="7CD6FABB">
-          <v:rect id="_x0000_i2150" style="width:0;height:1.5pt" o:hralign="center" o:hrstd="t" o:hr="t" fillcolor="#a0a0a0" stroked="f"/>
-        </w:pict>
-      </w:r>
-    </w:p>
+    <w:p/>
     <w:p>
       <w:pPr>
         <w:rPr>
@@ -4078,13 +3597,7 @@
         <w:t>Участник обязуется не раскрывать указанную информацию третьим лицам без письменного согласия Исполнителя.</w:t>
       </w:r>
     </w:p>
-    <w:p>
-      <w:r>
-        <w:pict w14:anchorId="5E5DCD45">
-          <v:rect id="_x0000_i2151" style="width:0;height:1.5pt" o:hralign="center" o:hrstd="t" o:hr="t" fillcolor="#a0a0a0" stroked="f"/>
-        </w:pict>
-      </w:r>
-    </w:p>
+    <w:p/>
     <w:p>
       <w:pPr>
         <w:rPr>
@@ -4105,13 +3618,7 @@
         <w:t>Обязанность соблюдать конфиденциальность сохраняется в течение пяти лет после прекращения действия настоящего договора.</w:t>
       </w:r>
     </w:p>
-    <w:p>
-      <w:r>
-        <w:pict w14:anchorId="4F98BB4A">
-          <v:rect id="_x0000_i2152" style="width:0;height:1.5pt" o:hralign="center" o:hrstd="t" o:hr="t" fillcolor="#a0a0a0" stroked="f"/>
-        </w:pict>
-      </w:r>
-    </w:p>
+    <w:p/>
     <w:p>
       <w:pPr>
         <w:rPr>
@@ -4148,13 +3655,7 @@
         <w:t>Исполнитель осуществляет обработку персональных данных Участника исключительно в целях исполнения настоящего договора.</w:t>
       </w:r>
     </w:p>
-    <w:p>
-      <w:r>
-        <w:pict w14:anchorId="3155DCF3">
-          <v:rect id="_x0000_i2153" style="width:0;height:1.5pt" o:hralign="center" o:hrstd="t" o:hr="t" fillcolor="#a0a0a0" stroked="f"/>
-        </w:pict>
-      </w:r>
-    </w:p>
+    <w:p/>
     <w:p>
       <w:pPr>
         <w:rPr>
@@ -4175,13 +3676,7 @@
         <w:t>Предоставляя персональные данные, Участник подтверждает свое согласие на их обработку в соответствии с Федеральным законом №152-ФЗ «О персональных данных».</w:t>
       </w:r>
     </w:p>
-    <w:p>
-      <w:r>
-        <w:pict w14:anchorId="460A32AA">
-          <v:rect id="_x0000_i2154" style="width:0;height:1.5pt" o:hralign="center" o:hrstd="t" o:hr="t" fillcolor="#a0a0a0" stroked="f"/>
-        </w:pict>
-      </w:r>
-    </w:p>
+    <w:p/>
     <w:p>
       <w:pPr>
         <w:rPr>
@@ -4246,13 +3741,7 @@
         <w:t xml:space="preserve">исполнения требований законодательства. </w:t>
       </w:r>
     </w:p>
-    <w:p>
-      <w:r>
-        <w:pict w14:anchorId="10467C2D">
-          <v:rect id="_x0000_i2155" style="width:0;height:1.5pt" o:hralign="center" o:hrstd="t" o:hr="t" fillcolor="#a0a0a0" stroked="f"/>
-        </w:pict>
-      </w:r>
-    </w:p>
+    <w:p/>
     <w:p>
       <w:pPr>
         <w:rPr>
@@ -4273,13 +3762,7 @@
         <w:t>Порядок обработки персональных данных определяется Политикой обработки персональных данных Исполнителя.</w:t>
       </w:r>
     </w:p>
-    <w:p>
-      <w:r>
-        <w:pict w14:anchorId="7B168AB5">
-          <v:rect id="_x0000_i2156" style="width:0;height:1.5pt" o:hralign="center" o:hrstd="t" o:hr="t" fillcolor="#a0a0a0" stroked="f"/>
-        </w:pict>
-      </w:r>
-    </w:p>
+    <w:p/>
     <w:p>
       <w:pPr>
         <w:rPr>
@@ -4315,13 +3798,7 @@
         <w:t>Исполнитель несет ответственность исключительно за надлежащее оказание услуг.</w:t>
       </w:r>
     </w:p>
-    <w:p>
-      <w:r>
-        <w:pict w14:anchorId="2AD44315">
-          <v:rect id="_x0000_i2157" style="width:0;height:1.5pt" o:hralign="center" o:hrstd="t" o:hr="t" fillcolor="#a0a0a0" stroked="f"/>
-        </w:pict>
-      </w:r>
-    </w:p>
+    <w:p/>
     <w:p>
       <w:pPr>
         <w:rPr>
@@ -4419,14 +3896,7 @@
         <w:t xml:space="preserve">невозможность трудоустройства по причинам, зависящим от Участника. </w:t>
       </w:r>
     </w:p>
-    <w:p>
-      <w:r>
-        <w:lastRenderedPageBreak/>
-        <w:pict w14:anchorId="2C1E43E3">
-          <v:rect id="_x0000_i2158" style="width:0;height:1.5pt" o:hralign="center" o:hrstd="t" o:hr="t" fillcolor="#a0a0a0" stroked="f"/>
-        </w:pict>
-      </w:r>
-    </w:p>
+    <w:p/>
     <w:p>
       <w:pPr>
         <w:rPr>
@@ -4502,13 +3972,7 @@
         <w:t xml:space="preserve">иными обстоятельствами на стороне Участника. </w:t>
       </w:r>
     </w:p>
-    <w:p>
-      <w:r>
-        <w:pict w14:anchorId="201F2B57">
-          <v:rect id="_x0000_i2159" style="width:0;height:1.5pt" o:hralign="center" o:hrstd="t" o:hr="t" fillcolor="#a0a0a0" stroked="f"/>
-        </w:pict>
-      </w:r>
-    </w:p>
+    <w:p/>
     <w:p>
       <w:pPr>
         <w:rPr>
@@ -4529,13 +3993,7 @@
         <w:t>Исполнитель не гарантирует достижения каких-либо экономических, профессиональных либо карьерных результатов.</w:t>
       </w:r>
     </w:p>
-    <w:p>
-      <w:r>
-        <w:pict w14:anchorId="66CE7435">
-          <v:rect id="_x0000_i2160" style="width:0;height:1.5pt" o:hralign="center" o:hrstd="t" o:hr="t" fillcolor="#a0a0a0" stroked="f"/>
-        </w:pict>
-      </w:r>
-    </w:p>
+    <w:p/>
     <w:p>
       <w:pPr>
         <w:rPr>
@@ -4556,13 +4014,7 @@
         <w:t>Любые примеры успешного трудоустройства, размещенные на сайте, в презентациях, социальных сетях либо рекламных материалах, являются примерами отдельных участников и не рассматриваются как обещание аналогичного результата для каждого Участника.</w:t>
       </w:r>
     </w:p>
-    <w:p>
-      <w:r>
-        <w:pict w14:anchorId="194CF9A9">
-          <v:rect id="_x0000_i2161" style="width:0;height:1.5pt" o:hralign="center" o:hrstd="t" o:hr="t" fillcolor="#a0a0a0" stroked="f"/>
-        </w:pict>
-      </w:r>
-    </w:p>
+    <w:p/>
     <w:p>
       <w:pPr>
         <w:rPr>
@@ -4598,13 +4050,7 @@
         <w:t>Стороны освобождаются от ответственности за полное либо частичное неисполнение обязательств вследствие обстоятельств непреодолимой силы.</w:t>
       </w:r>
     </w:p>
-    <w:p>
-      <w:r>
-        <w:pict w14:anchorId="39128B28">
-          <v:rect id="_x0000_i2162" style="width:0;height:1.5pt" o:hralign="center" o:hrstd="t" o:hr="t" fillcolor="#a0a0a0" stroked="f"/>
-        </w:pict>
-      </w:r>
-    </w:p>
+    <w:p/>
     <w:p>
       <w:pPr>
         <w:rPr>
@@ -4766,13 +4212,7 @@
         <w:t xml:space="preserve">иные чрезвычайные обстоятельства, находящиеся вне разумного контроля Исполнителя. </w:t>
       </w:r>
     </w:p>
-    <w:p>
-      <w:r>
-        <w:pict w14:anchorId="1771514E">
-          <v:rect id="_x0000_i2163" style="width:0;height:1.5pt" o:hralign="center" o:hrstd="t" o:hr="t" fillcolor="#a0a0a0" stroked="f"/>
-        </w:pict>
-      </w:r>
-    </w:p>
+    <w:p/>
     <w:p>
       <w:pPr>
         <w:rPr>
@@ -4828,13 +4268,7 @@
         <w:t>Участник вправе отказаться от исполнения настоящего договора и обратиться с заявлением о возврате денежных средств в случаях и порядке, предусмотренных законодательством Российской Федерации и настоящей Офертой.</w:t>
       </w:r>
     </w:p>
-    <w:p>
-      <w:r>
-        <w:pict w14:anchorId="6B8546EB">
-          <v:rect id="_x0000_i2395" style="width:0;height:1.5pt" o:hralign="center" o:hrstd="t" o:hr="t" fillcolor="#a0a0a0" stroked="f"/>
-        </w:pict>
-      </w:r>
-    </w:p>
+    <w:p/>
     <w:p>
       <w:pPr>
         <w:rPr>
@@ -4951,13 +4385,7 @@
         <w:t>Исполнитель вправе запросить дополнительные сведения, необходимые для идентификации заявителя.</w:t>
       </w:r>
     </w:p>
-    <w:p>
-      <w:r>
-        <w:pict w14:anchorId="72FE98E8">
-          <v:rect id="_x0000_i2396" style="width:0;height:1.5pt" o:hralign="center" o:hrstd="t" o:hr="t" fillcolor="#a0a0a0" stroked="f"/>
-        </w:pict>
-      </w:r>
-    </w:p>
+    <w:p/>
     <w:p>
       <w:pPr>
         <w:rPr>
@@ -4988,13 +4416,7 @@
         <w:t xml:space="preserve"> с момента получения всей необходимой информации.</w:t>
       </w:r>
     </w:p>
-    <w:p>
-      <w:r>
-        <w:pict w14:anchorId="2C3D0015">
-          <v:rect id="_x0000_i2397" style="width:0;height:1.5pt" o:hralign="center" o:hrstd="t" o:hr="t" fillcolor="#a0a0a0" stroked="f"/>
-        </w:pict>
-      </w:r>
-    </w:p>
+    <w:p/>
     <w:p>
       <w:pPr>
         <w:rPr>
@@ -5016,13 +4438,7 @@
         <w:t>При удовлетворении заявления возврат денежных средств осуществляется способом, определяемым Исполнителем, если иной порядок не установлен законодательством Российской Федерации.</w:t>
       </w:r>
     </w:p>
-    <w:p>
-      <w:r>
-        <w:pict w14:anchorId="3B38EC96">
-          <v:rect id="_x0000_i2398" style="width:0;height:1.5pt" o:hralign="center" o:hrstd="t" o:hr="t" fillcolor="#a0a0a0" stroked="f"/>
-        </w:pict>
-      </w:r>
-    </w:p>
+    <w:p/>
     <w:p>
       <w:pPr>
         <w:rPr>
@@ -5188,13 +4604,7 @@
         <w:t xml:space="preserve">иные услуги, оказанные Исполнителем. </w:t>
       </w:r>
     </w:p>
-    <w:p>
-      <w:r>
-        <w:pict w14:anchorId="11D910DC">
-          <v:rect id="_x0000_i2399" style="width:0;height:1.5pt" o:hralign="center" o:hrstd="t" o:hr="t" fillcolor="#a0a0a0" stroked="f"/>
-        </w:pict>
-      </w:r>
-    </w:p>
+    <w:p/>
     <w:p>
       <w:pPr>
         <w:rPr>
@@ -5215,13 +4625,7 @@
         <w:t>Факт открытия материалов, просмотра видеозаписей, скачивания файлов либо получения доступа к ним подтверждает оказание соответствующей части услуг.</w:t>
       </w:r>
     </w:p>
-    <w:p>
-      <w:r>
-        <w:pict w14:anchorId="4F687DA5">
-          <v:rect id="_x0000_i2400" style="width:0;height:1.5pt" o:hralign="center" o:hrstd="t" o:hr="t" fillcolor="#a0a0a0" stroked="f"/>
-        </w:pict>
-      </w:r>
-    </w:p>
+    <w:p/>
     <w:p>
       <w:pPr>
         <w:rPr>
@@ -5242,13 +4646,7 @@
         <w:t>Непосещение практических занятий по причинам, зависящим от Участника, само по себе не является основанием для возврата денежных средств за уже оказанные услуги.</w:t>
       </w:r>
     </w:p>
-    <w:p>
-      <w:r>
-        <w:pict w14:anchorId="76A905D8">
-          <v:rect id="_x0000_i2401" style="width:0;height:1.5pt" o:hralign="center" o:hrstd="t" o:hr="t" fillcolor="#a0a0a0" stroked="f"/>
-        </w:pict>
-      </w:r>
-    </w:p>
+    <w:p/>
     <w:p>
       <w:pPr>
         <w:rPr>
@@ -5269,13 +4667,7 @@
         <w:t>Возврат денежных средств не осуществляется за услуги, оказанные надлежащим образом к моменту получения Исполнителем заявления об отказе от договора.</w:t>
       </w:r>
     </w:p>
-    <w:p>
-      <w:r>
-        <w:pict w14:anchorId="4D5226AE">
-          <v:rect id="_x0000_i2402" style="width:0;height:1.5pt" o:hralign="center" o:hrstd="t" o:hr="t" fillcolor="#a0a0a0" stroked="f"/>
-        </w:pict>
-      </w:r>
-    </w:p>
+    <w:p/>
     <w:p>
       <w:pPr>
         <w:rPr>
@@ -5297,13 +4689,7 @@
         <w:t>Если Участник полностью прошел Программу, получил доступ ко всем материалам и Исполнитель оказал предусмотренные договором услуги, обязательства Исполнителя считаются исполненными в полном объеме.</w:t>
       </w:r>
     </w:p>
-    <w:p>
-      <w:r>
-        <w:pict w14:anchorId="63A2BAC0">
-          <v:rect id="_x0000_i2403" style="width:0;height:1.5pt" o:hralign="center" o:hrstd="t" o:hr="t" fillcolor="#a0a0a0" stroked="f"/>
-        </w:pict>
-      </w:r>
-    </w:p>
+    <w:p/>
     <w:p>
       <w:pPr>
         <w:rPr>
@@ -5324,13 +4710,191 @@
         <w:t>Комиссии банков, платежных систем и кредитных организаций, удержанные при проведении платежей, возврату не подлежат, если иное не предусмотрено законодательством Российской Федерации.</w:t>
       </w:r>
     </w:p>
-    <w:p>
-      <w:r>
-        <w:pict w14:anchorId="74E333E9">
-          <v:rect id="_x0000_i2404" style="width:0;height:1.5pt" o:hralign="center" o:hrstd="t" o:hr="t" fillcolor="#a0a0a0" stroked="f"/>
-        </w:pict>
-      </w:r>
-    </w:p>
+    <w:p/>
+    <w:p>
+      <w:r>
+        <w:t>В целях определения стоимости фактически оказанных услуг при досрочном отказе Участника от исполнения настоящего Договора стороны согласовали следующую структуру стоимости Программы.</w:t>
+      </w:r>
+    </w:p>
+    <w:p>
+      <w:r>
+        <w:t>Стоимость каждого этапа рассчитывается как процент от общей стоимости Программы.</w:t>
+      </w:r>
+    </w:p>
+    <w:p/>
+    <w:tbl>
+      <w:tblPr>
+        <w:tblW w:w="0" w:type="auto"/>
+        <w:tblCellSpacing w:w="15" w:type="dxa"/>
+        <w:tblCellMar>
+          <w:top w:w="15" w:type="dxa"/>
+          <w:left w:w="15" w:type="dxa"/>
+          <w:bottom w:w="15" w:type="dxa"/>
+          <w:right w:w="15" w:type="dxa"/>
+        </w:tblCellMar>
+        <w:tblLook w:val="04A0" w:firstRow="1" w:lastRow="0" w:firstColumn="1" w:lastColumn="0" w:noHBand="0" w:noVBand="1"/>
+      </w:tblPr>
+      <w:tblGrid>
+        <w:gridCol w:w="7295"/>
+        <w:gridCol w:w="2060"/>
+      </w:tblGrid>
+      <w:tr>
+        <w:trPr>
+          <w:tblHeader/>
+          <w:tblCellSpacing w:w="15" w:type="dxa"/>
+        </w:trPr>
+        <w:tc>
+          <w:tcPr>
+            <w:tcW w:w="0" w:type="auto"/>
+            <w:vAlign w:val="center"/>
+            <w:hideMark/>
+          </w:tcPr>
+          <w:p>
+            <w:pPr>
+              <w:rPr>
+                <w:b/>
+                <w:bCs/>
+              </w:rPr>
+            </w:pPr>
+            <w:r>
+              <w:rPr>
+                <w:b/>
+                <w:bCs/>
+              </w:rPr>
+              <w:t>Этап оказания услуг</w:t>
+            </w:r>
+          </w:p>
+        </w:tc>
+        <w:tc>
+          <w:tcPr>
+            <w:tcW w:w="0" w:type="auto"/>
+            <w:vAlign w:val="center"/>
+            <w:hideMark/>
+          </w:tcPr>
+          <w:p>
+            <w:pPr>
+              <w:rPr>
+                <w:b/>
+                <w:bCs/>
+              </w:rPr>
+            </w:pPr>
+            <w:r>
+              <w:rPr>
+                <w:b/>
+                <w:bCs/>
+              </w:rPr>
+              <w:t>Доля от стоимости Программы</w:t>
+            </w:r>
+          </w:p>
+        </w:tc>
+      </w:tr>
+      <w:tr>
+        <w:trPr>
+          <w:tblCellSpacing w:w="15" w:type="dxa"/>
+        </w:trPr>
+        <w:tc>
+          <w:tcPr>
+            <w:tcW w:w="0" w:type="auto"/>
+            <w:vAlign w:val="center"/>
+            <w:hideMark/>
+          </w:tcPr>
+          <w:p>
+            <w:r>
+              <w:t>Предоставление доступа к базе материалов, видеоматериалам, презентациям, шаблонам, чек-листам, скриптам и иным материалам Программы</w:t>
+            </w:r>
+          </w:p>
+        </w:tc>
+        <w:tc>
+          <w:tcPr>
+            <w:tcW w:w="0" w:type="auto"/>
+            <w:vAlign w:val="center"/>
+            <w:hideMark/>
+          </w:tcPr>
+          <w:p>
+            <w:r>
+              <w:rPr>
+                <w:b/>
+                <w:bCs/>
+              </w:rPr>
+              <w:t>40%</w:t>
+            </w:r>
+          </w:p>
+        </w:tc>
+      </w:tr>
+      <w:tr>
+        <w:trPr>
+          <w:tblCellSpacing w:w="15" w:type="dxa"/>
+        </w:trPr>
+        <w:tc>
+          <w:tcPr>
+            <w:tcW w:w="0" w:type="auto"/>
+            <w:vAlign w:val="center"/>
+            <w:hideMark/>
+          </w:tcPr>
+          <w:p>
+            <w:r>
+              <w:t>Практическая часть Программы (5 дней)</w:t>
+            </w:r>
+          </w:p>
+        </w:tc>
+        <w:tc>
+          <w:tcPr>
+            <w:tcW w:w="0" w:type="auto"/>
+            <w:vAlign w:val="center"/>
+            <w:hideMark/>
+          </w:tcPr>
+          <w:p>
+            <w:r>
+              <w:rPr>
+                <w:b/>
+                <w:bCs/>
+              </w:rPr>
+              <w:t>40%</w:t>
+            </w:r>
+          </w:p>
+        </w:tc>
+      </w:tr>
+      <w:tr>
+        <w:trPr>
+          <w:tblCellSpacing w:w="15" w:type="dxa"/>
+        </w:trPr>
+        <w:tc>
+          <w:tcPr>
+            <w:tcW w:w="0" w:type="auto"/>
+            <w:vAlign w:val="center"/>
+            <w:hideMark/>
+          </w:tcPr>
+          <w:p>
+            <w:r>
+              <w:t>Карьерное сопровождение</w:t>
+            </w:r>
+          </w:p>
+        </w:tc>
+        <w:tc>
+          <w:tcPr>
+            <w:tcW w:w="0" w:type="auto"/>
+            <w:vAlign w:val="center"/>
+            <w:hideMark/>
+          </w:tcPr>
+          <w:p>
+            <w:r>
+              <w:rPr>
+                <w:b/>
+                <w:bCs/>
+              </w:rPr>
+              <w:t>20%</w:t>
+            </w:r>
+          </w:p>
+        </w:tc>
+      </w:tr>
+    </w:tbl>
+    <w:p/>
+    <w:p>
+      <w:r>
+        <w:t>Стоимость практической части составляет 40% стоимости Программы и рассчитывается пропорционально количеству проведенных практических дней. Стоимость одного практического дня составляет 8% стоимости Программы.</w:t>
+      </w:r>
+    </w:p>
+    <w:p/>
     <w:p>
       <w:pPr>
         <w:rPr>
@@ -5440,6 +5004,7 @@
         </w:numPr>
       </w:pPr>
       <w:r>
+        <w:lastRenderedPageBreak/>
         <w:t xml:space="preserve">оскорбления сотрудников или иных участников; </w:t>
       </w:r>
     </w:p>
@@ -5487,13 +5052,7 @@
         <w:t xml:space="preserve">иных существенных нарушений условий настоящего договора. </w:t>
       </w:r>
     </w:p>
-    <w:p>
-      <w:r>
-        <w:pict w14:anchorId="4B4B5B85">
-          <v:rect id="_x0000_i2405" style="width:0;height:1.5pt" o:hralign="center" o:hrstd="t" o:hr="t" fillcolor="#a0a0a0" stroked="f"/>
-        </w:pict>
-      </w:r>
-    </w:p>
+    <w:p/>
     <w:p>
       <w:pPr>
         <w:rPr>
@@ -5514,13 +5073,7 @@
         <w:t>В случае отказа Исполнителя доступ к Программе может быть прекращен незамедлительно.</w:t>
       </w:r>
     </w:p>
-    <w:p>
-      <w:r>
-        <w:pict w14:anchorId="2502CA1F">
-          <v:rect id="_x0000_i2406" style="width:0;height:1.5pt" o:hralign="center" o:hrstd="t" o:hr="t" fillcolor="#a0a0a0" stroked="f"/>
-        </w:pict>
-      </w:r>
-    </w:p>
+    <w:p/>
     <w:p>
       <w:pPr>
         <w:rPr>
@@ -5541,13 +5094,7 @@
         <w:t>При этом Исполнитель производит расчет стоимости фактически оказанных услуг в порядке, установленном настоящей Офертой и законодательством Российской Федерации.</w:t>
       </w:r>
     </w:p>
-    <w:p>
-      <w:r>
-        <w:pict w14:anchorId="7710C1B4">
-          <v:rect id="_x0000_i2407" style="width:0;height:1.5pt" o:hralign="center" o:hrstd="t" o:hr="t" fillcolor="#a0a0a0" stroked="f"/>
-        </w:pict>
-      </w:r>
-    </w:p>
+    <w:p/>
     <w:p>
       <w:pPr>
         <w:rPr>
@@ -5580,180 +5127,162 @@
     </w:p>
     <w:p>
       <w:r>
+        <w:t>Стороны признают юридическую силу документов, сообщений и уведомлений, направленных посредством:</w:t>
+      </w:r>
+    </w:p>
+    <w:p>
+      <w:pPr>
+        <w:numPr>
+          <w:ilvl w:val="0"/>
+          <w:numId w:val="28"/>
+        </w:numPr>
+      </w:pPr>
+      <w:r>
+        <w:t xml:space="preserve">электронной почты; </w:t>
+      </w:r>
+    </w:p>
+    <w:p>
+      <w:pPr>
+        <w:numPr>
+          <w:ilvl w:val="0"/>
+          <w:numId w:val="28"/>
+        </w:numPr>
+      </w:pPr>
+      <w:proofErr w:type="spellStart"/>
+      <w:r>
+        <w:t>Telegram</w:t>
+      </w:r>
+      <w:proofErr w:type="spellEnd"/>
+      <w:r>
+        <w:t xml:space="preserve">; </w:t>
+      </w:r>
+    </w:p>
+    <w:p>
+      <w:pPr>
+        <w:numPr>
+          <w:ilvl w:val="0"/>
+          <w:numId w:val="28"/>
+        </w:numPr>
+      </w:pPr>
+      <w:r>
+        <w:t xml:space="preserve">иных мессенджеров; </w:t>
+      </w:r>
+    </w:p>
+    <w:p>
+      <w:pPr>
+        <w:numPr>
+          <w:ilvl w:val="0"/>
+          <w:numId w:val="28"/>
+        </w:numPr>
+      </w:pPr>
+      <w:r>
+        <w:t xml:space="preserve">CRM-системы; </w:t>
+      </w:r>
+    </w:p>
+    <w:p>
+      <w:pPr>
+        <w:numPr>
+          <w:ilvl w:val="0"/>
+          <w:numId w:val="28"/>
+        </w:numPr>
+      </w:pPr>
+      <w:r>
+        <w:t xml:space="preserve">личного кабинета; </w:t>
+      </w:r>
+    </w:p>
+    <w:p>
+      <w:pPr>
+        <w:numPr>
+          <w:ilvl w:val="0"/>
+          <w:numId w:val="28"/>
+        </w:numPr>
+      </w:pPr>
+      <w:r>
+        <w:t xml:space="preserve">SMS; </w:t>
+      </w:r>
+    </w:p>
+    <w:p>
+      <w:pPr>
+        <w:numPr>
+          <w:ilvl w:val="0"/>
+          <w:numId w:val="28"/>
+        </w:numPr>
+      </w:pPr>
+      <w:r>
+        <w:t xml:space="preserve">иных электронных средств связи. </w:t>
+      </w:r>
+    </w:p>
+    <w:p/>
+    <w:p>
+      <w:pPr>
+        <w:rPr>
+          <w:b/>
+          <w:bCs/>
+        </w:rPr>
+      </w:pPr>
+      <w:r>
+        <w:rPr>
+          <w:b/>
+          <w:bCs/>
+        </w:rPr>
+        <w:t>19.2.</w:t>
+      </w:r>
+    </w:p>
+    <w:p>
+      <w:r>
+        <w:t>Сообщения считаются полученными с момента их отправки Исполнителем по контактным данным, указанным Участником.</w:t>
+      </w:r>
+    </w:p>
+    <w:p/>
+    <w:p>
+      <w:pPr>
+        <w:rPr>
+          <w:b/>
+          <w:bCs/>
+        </w:rPr>
+      </w:pPr>
+      <w:r>
+        <w:rPr>
+          <w:b/>
+          <w:bCs/>
+        </w:rPr>
+        <w:t>19.3.</w:t>
+      </w:r>
+    </w:p>
+    <w:p>
+      <w:r>
+        <w:t>Риск неполучения сообщений вследствие указания неверных контактных данных либо отсутствия доступа к средствам связи несет Участник.</w:t>
+      </w:r>
+    </w:p>
+    <w:p/>
+    <w:p>
+      <w:pPr>
+        <w:rPr>
+          <w:b/>
+          <w:bCs/>
+        </w:rPr>
+      </w:pPr>
+      <w:r>
+        <w:rPr>
+          <w:b/>
+          <w:bCs/>
+        </w:rPr>
+        <w:t>20. Изменение условий Оферты</w:t>
+      </w:r>
+    </w:p>
+    <w:p>
+      <w:pPr>
+        <w:rPr>
+          <w:b/>
+          <w:bCs/>
+        </w:rPr>
+      </w:pPr>
+      <w:r>
+        <w:rPr>
+          <w:b/>
+          <w:bCs/>
+        </w:rPr>
         <w:lastRenderedPageBreak/>
-        <w:t>Стороны признают юридическую силу документов, сообщений и уведомлений, направленных посредством:</w:t>
-      </w:r>
-    </w:p>
-    <w:p>
-      <w:pPr>
-        <w:numPr>
-          <w:ilvl w:val="0"/>
-          <w:numId w:val="28"/>
-        </w:numPr>
-      </w:pPr>
-      <w:r>
-        <w:t xml:space="preserve">электронной почты; </w:t>
-      </w:r>
-    </w:p>
-    <w:p>
-      <w:pPr>
-        <w:numPr>
-          <w:ilvl w:val="0"/>
-          <w:numId w:val="28"/>
-        </w:numPr>
-      </w:pPr>
-      <w:proofErr w:type="spellStart"/>
-      <w:r>
-        <w:t>Telegram</w:t>
-      </w:r>
-      <w:proofErr w:type="spellEnd"/>
-      <w:r>
-        <w:t xml:space="preserve">; </w:t>
-      </w:r>
-    </w:p>
-    <w:p>
-      <w:pPr>
-        <w:numPr>
-          <w:ilvl w:val="0"/>
-          <w:numId w:val="28"/>
-        </w:numPr>
-      </w:pPr>
-      <w:r>
-        <w:t xml:space="preserve">иных мессенджеров; </w:t>
-      </w:r>
-    </w:p>
-    <w:p>
-      <w:pPr>
-        <w:numPr>
-          <w:ilvl w:val="0"/>
-          <w:numId w:val="28"/>
-        </w:numPr>
-      </w:pPr>
-      <w:r>
-        <w:t xml:space="preserve">CRM-системы; </w:t>
-      </w:r>
-    </w:p>
-    <w:p>
-      <w:pPr>
-        <w:numPr>
-          <w:ilvl w:val="0"/>
-          <w:numId w:val="28"/>
-        </w:numPr>
-      </w:pPr>
-      <w:r>
-        <w:t xml:space="preserve">личного кабинета; </w:t>
-      </w:r>
-    </w:p>
-    <w:p>
-      <w:pPr>
-        <w:numPr>
-          <w:ilvl w:val="0"/>
-          <w:numId w:val="28"/>
-        </w:numPr>
-      </w:pPr>
-      <w:r>
-        <w:t xml:space="preserve">SMS; </w:t>
-      </w:r>
-    </w:p>
-    <w:p>
-      <w:pPr>
-        <w:numPr>
-          <w:ilvl w:val="0"/>
-          <w:numId w:val="28"/>
-        </w:numPr>
-      </w:pPr>
-      <w:r>
-        <w:t xml:space="preserve">иных электронных средств связи. </w:t>
-      </w:r>
-    </w:p>
-    <w:p>
-      <w:r>
-        <w:pict w14:anchorId="58E40A4E">
-          <v:rect id="_x0000_i2408" style="width:0;height:1.5pt" o:hralign="center" o:hrstd="t" o:hr="t" fillcolor="#a0a0a0" stroked="f"/>
-        </w:pict>
-      </w:r>
-    </w:p>
-    <w:p>
-      <w:pPr>
-        <w:rPr>
-          <w:b/>
-          <w:bCs/>
-        </w:rPr>
-      </w:pPr>
-      <w:r>
-        <w:rPr>
-          <w:b/>
-          <w:bCs/>
-        </w:rPr>
-        <w:t>19.2.</w:t>
-      </w:r>
-    </w:p>
-    <w:p>
-      <w:r>
-        <w:t>Сообщения считаются полученными с момента их отправки Исполнителем по контактным данным, указанным Участником.</w:t>
-      </w:r>
-    </w:p>
-    <w:p>
-      <w:r>
-        <w:pict w14:anchorId="3F6C2C2D">
-          <v:rect id="_x0000_i2409" style="width:0;height:1.5pt" o:hralign="center" o:hrstd="t" o:hr="t" fillcolor="#a0a0a0" stroked="f"/>
-        </w:pict>
-      </w:r>
-    </w:p>
-    <w:p>
-      <w:pPr>
-        <w:rPr>
-          <w:b/>
-          <w:bCs/>
-        </w:rPr>
-      </w:pPr>
-      <w:r>
-        <w:rPr>
-          <w:b/>
-          <w:bCs/>
-        </w:rPr>
-        <w:t>19.3.</w:t>
-      </w:r>
-    </w:p>
-    <w:p>
-      <w:r>
-        <w:t>Риск неполучения сообщений вследствие указания неверных контактных данных либо отсутствия доступа к средствам связи несет Участник.</w:t>
-      </w:r>
-    </w:p>
-    <w:p>
-      <w:r>
-        <w:pict w14:anchorId="33E78C05">
-          <v:rect id="_x0000_i2410" style="width:0;height:1.5pt" o:hralign="center" o:hrstd="t" o:hr="t" fillcolor="#a0a0a0" stroked="f"/>
-        </w:pict>
-      </w:r>
-    </w:p>
-    <w:p>
-      <w:pPr>
-        <w:rPr>
-          <w:b/>
-          <w:bCs/>
-        </w:rPr>
-      </w:pPr>
-      <w:r>
-        <w:rPr>
-          <w:b/>
-          <w:bCs/>
-        </w:rPr>
-        <w:t>20. Изменение условий Оферты</w:t>
-      </w:r>
-    </w:p>
-    <w:p>
-      <w:pPr>
-        <w:rPr>
-          <w:b/>
-          <w:bCs/>
-        </w:rPr>
-      </w:pPr>
-      <w:r>
-        <w:rPr>
-          <w:b/>
-          <w:bCs/>
-        </w:rPr>
         <w:t>20.1.</w:t>
       </w:r>
     </w:p>
@@ -5762,13 +5291,7 @@
         <w:t>Исполнитель вправе в любое время изменить условия настоящей Оферты без получения отдельного согласия Участников.</w:t>
       </w:r>
     </w:p>
-    <w:p>
-      <w:r>
-        <w:pict w14:anchorId="54F37534">
-          <v:rect id="_x0000_i2411" style="width:0;height:1.5pt" o:hralign="center" o:hrstd="t" o:hr="t" fillcolor="#a0a0a0" stroked="f"/>
-        </w:pict>
-      </w:r>
-    </w:p>
+    <w:p/>
     <w:p>
       <w:pPr>
         <w:rPr>
@@ -5789,13 +5312,7 @@
         <w:t>Новая редакция вступает в силу с момента ее опубликования на официальном сайте Исполнителя, если иной срок не указан в самой редакции.</w:t>
       </w:r>
     </w:p>
-    <w:p>
-      <w:r>
-        <w:pict w14:anchorId="1AE4407B">
-          <v:rect id="_x0000_i2412" style="width:0;height:1.5pt" o:hralign="center" o:hrstd="t" o:hr="t" fillcolor="#a0a0a0" stroked="f"/>
-        </w:pict>
-      </w:r>
-    </w:p>
+    <w:p/>
     <w:p>
       <w:pPr>
         <w:rPr>
@@ -5816,13 +5333,7 @@
         <w:t>К отношениям сторон применяется редакция Оферты, действовавшая на дату акцепта Участником, если иное не предусмотрено законодательством Российской Федерации.</w:t>
       </w:r>
     </w:p>
-    <w:p>
-      <w:r>
-        <w:pict w14:anchorId="418A7A70">
-          <v:rect id="_x0000_i2413" style="width:0;height:1.5pt" o:hralign="center" o:hrstd="t" o:hr="t" fillcolor="#a0a0a0" stroked="f"/>
-        </w:pict>
-      </w:r>
-    </w:p>
+    <w:p/>
     <w:p>
       <w:pPr>
         <w:rPr>
@@ -5858,14 +5369,7 @@
         <w:t>Все разногласия и споры стороны стремятся урегулировать путем переговоров.</w:t>
       </w:r>
     </w:p>
-    <w:p>
-      <w:r>
-        <w:lastRenderedPageBreak/>
-        <w:pict w14:anchorId="7887E6A9">
-          <v:rect id="_x0000_i2414" style="width:0;height:1.5pt" o:hralign="center" o:hrstd="t" o:hr="t" fillcolor="#a0a0a0" stroked="f"/>
-        </w:pict>
-      </w:r>
-    </w:p>
+    <w:p/>
     <w:p>
       <w:pPr>
         <w:rPr>
@@ -5886,13 +5390,7 @@
         <w:t>До обращения в суд обязательным является соблюдение претензионного порядка.</w:t>
       </w:r>
     </w:p>
-    <w:p>
-      <w:r>
-        <w:pict w14:anchorId="10A8E8A5">
-          <v:rect id="_x0000_i2415" style="width:0;height:1.5pt" o:hralign="center" o:hrstd="t" o:hr="t" fillcolor="#a0a0a0" stroked="f"/>
-        </w:pict>
-      </w:r>
-    </w:p>
+    <w:p/>
     <w:p>
       <w:pPr>
         <w:rPr>
@@ -5927,13 +5425,7 @@
         <w:t>либо по почтовому адресу Исполнителя.</w:t>
       </w:r>
     </w:p>
-    <w:p>
-      <w:r>
-        <w:pict w14:anchorId="3AF1B02C">
-          <v:rect id="_x0000_i2416" style="width:0;height:1.5pt" o:hralign="center" o:hrstd="t" o:hr="t" fillcolor="#a0a0a0" stroked="f"/>
-        </w:pict>
-      </w:r>
-    </w:p>
+    <w:p/>
     <w:p>
       <w:pPr>
         <w:rPr>
@@ -5964,13 +5456,7 @@
         <w:t xml:space="preserve"> со дня ее получения.</w:t>
       </w:r>
     </w:p>
-    <w:p>
-      <w:r>
-        <w:pict w14:anchorId="65006498">
-          <v:rect id="_x0000_i2417" style="width:0;height:1.5pt" o:hralign="center" o:hrstd="t" o:hr="t" fillcolor="#a0a0a0" stroked="f"/>
-        </w:pict>
-      </w:r>
-    </w:p>
+    <w:p/>
     <w:p>
       <w:pPr>
         <w:rPr>
@@ -5991,13 +5477,7 @@
         <w:t>При недостижении соглашения спор подлежит рассмотрению в суде в соответствии с действующим законодательством Российской Федерации.</w:t>
       </w:r>
     </w:p>
-    <w:p>
-      <w:r>
-        <w:pict w14:anchorId="5B20088A">
-          <v:rect id="_x0000_i2418" style="width:0;height:1.5pt" o:hralign="center" o:hrstd="t" o:hr="t" fillcolor="#a0a0a0" stroked="f"/>
-        </w:pict>
-      </w:r>
-    </w:p>
+    <w:p/>
     <w:p>
       <w:pPr>
         <w:rPr>
@@ -6033,13 +5513,7 @@
         <w:t>Настоящая Оферта регулируется законодательством Российской Федерации.</w:t>
       </w:r>
     </w:p>
-    <w:p>
-      <w:r>
-        <w:pict w14:anchorId="76F4707E">
-          <v:rect id="_x0000_i2419" style="width:0;height:1.5pt" o:hralign="center" o:hrstd="t" o:hr="t" fillcolor="#a0a0a0" stroked="f"/>
-        </w:pict>
-      </w:r>
-    </w:p>
+    <w:p/>
     <w:p>
       <w:pPr>
         <w:rPr>
@@ -6060,13 +5534,7 @@
         <w:t>Если какое-либо положение настоящей Оферты будет признано недействительным, остальные положения сохраняют юридическую силу.</w:t>
       </w:r>
     </w:p>
-    <w:p>
-      <w:r>
-        <w:pict w14:anchorId="1A8C943A">
-          <v:rect id="_x0000_i2420" style="width:0;height:1.5pt" o:hralign="center" o:hrstd="t" o:hr="t" fillcolor="#a0a0a0" stroked="f"/>
-        </w:pict>
-      </w:r>
-    </w:p>
+    <w:p/>
     <w:p>
       <w:pPr>
         <w:rPr>
@@ -6087,13 +5555,7 @@
         <w:t>Во всем, что не урегулировано настоящей Офертой, стороны руководствуются законодательством Российской Федерации.</w:t>
       </w:r>
     </w:p>
-    <w:p>
-      <w:r>
-        <w:pict w14:anchorId="1E1F31B1">
-          <v:rect id="_x0000_i2421" style="width:0;height:1.5pt" o:hralign="center" o:hrstd="t" o:hr="t" fillcolor="#a0a0a0" stroked="f"/>
-        </w:pict>
-      </w:r>
-    </w:p>
+    <w:p/>
     <w:p>
       <w:pPr>
         <w:rPr>
@@ -6155,7 +5617,6 @@
         </w:numPr>
       </w:pPr>
       <w:r>
-        <w:lastRenderedPageBreak/>
         <w:t xml:space="preserve">обладает необходимой дееспособностью; </w:t>
       </w:r>
     </w:p>
@@ -6181,13 +5642,7 @@
         <w:t xml:space="preserve">дает согласие на обработку персональных данных в объеме, необходимом для исполнения договора. </w:t>
       </w:r>
     </w:p>
-    <w:p>
-      <w:r>
-        <w:pict w14:anchorId="2DC204C1">
-          <v:rect id="_x0000_i2422" style="width:0;height:1.5pt" o:hralign="center" o:hrstd="t" o:hr="t" fillcolor="#a0a0a0" stroked="f"/>
-        </w:pict>
-      </w:r>
-    </w:p>
+    <w:p/>
     <w:p>
       <w:pPr>
         <w:rPr>
@@ -6208,13 +5663,7 @@
         <w:t>Настоящая Оферта действует бессрочно до момента ее отзыва Исполнителем.</w:t>
       </w:r>
     </w:p>
-    <w:p>
-      <w:r>
-        <w:pict w14:anchorId="073D3576">
-          <v:rect id="_x0000_i2423" style="width:0;height:1.5pt" o:hralign="center" o:hrstd="t" o:hr="t" fillcolor="#a0a0a0" stroked="f"/>
-        </w:pict>
-      </w:r>
-    </w:p>
+    <w:p/>
     <w:p>
       <w:pPr>
         <w:rPr>

</xml_diff>